<commit_message>
KadaiNova - Assignment PDF Generator
</commit_message>
<xml_diff>
--- a/jrsu_word_file.docx
+++ b/jrsu_word_file.docx
@@ -111,11 +111,9 @@
         </mc:AlternateContent>
       </w:r>
       <w:r>
-        <w:t xml:space="preserve">JHARKHAND RAKSHA SHAKTI UNIVERSITY,</w:t>
+        <w:t>{{college_name}}</w:t>
       </w:r>
-      <w:r>
-        <w:t xml:space="preserve">RANCHI</w:t>
-      </w:r>
+      <w:r/>
       <w:r/>
     </w:p>
     <w:p>
@@ -262,7 +260,7 @@
         <w:rPr/>
       </w:pPr>
       <w:r>
-        <w:t xml:space="preserve">BCACS SEMESTER-</w:t>
+        <w:t>{{your_short_department_name}} SEMESTER-</w:t>
       </w:r>
       <w:r>
         <w:t xml:space="preserve">{{semester_no}} PAPER (</w:t>
@@ -2613,7 +2611,7 @@
           <w:sz w:val="28"/>
           <w:szCs w:val="28"/>
         </w:rPr>
-        <w:t xml:space="preserve">, from Jharkhand Raksha Shakti University, Ranchi.</w:t>
+        <w:t>, from {{college_name}}.</w:t>
       </w:r>
       <w:r>
         <w:rPr>
@@ -2701,7 +2699,7 @@
           <w:sz w:val="28"/>
           <w:szCs w:val="28"/>
         </w:rPr>
-        <w:t xml:space="preserve">” in Jharkhand Raksha Shakti University, Ranchi.</w:t>
+        <w:t>” in {{college_name}}.</w:t>
       </w:r>
       <w:r>
         <w:rPr>

</xml_diff>